<commit_message>
feat: scaffold shared utilities and python extraction script
</commit_message>
<xml_diff>
--- a/Agile_Docs/Implementation Plan MVP1.docx
+++ b/Agile_Docs/Implementation Plan MVP1.docx
@@ -567,6 +567,251 @@
         <w:t>- Ensure the directory structure in `D:\quiz_system` aligns with the domain-agnostic approach.</w:t>
       </w:r>
     </w:p>
+    <w:p>
+      <w:r>
+        <w:br w:type="page"/>
+      </w:r>
+    </w:p>
+    <w:p>
+      <w:r>
+        <w:lastRenderedPageBreak/>
+        <w:t># Data Extraction &amp; Shared Utilities Implementation Plan</w:t>
+      </w:r>
+    </w:p>
+    <w:p/>
+    <w:p>
+      <w:r>
+        <w:t>Based on your approval for Pathway 1 and the architectural requirement for modularized, homogeneous components, this plan outlines the Python extraction spike and the foundational utility architecture.</w:t>
+      </w:r>
+    </w:p>
+    <w:p/>
+    <w:p>
+      <w:r>
+        <w:t>## User Review Required</w:t>
+      </w:r>
+    </w:p>
+    <w:p/>
+    <w:p>
+      <w:r>
+        <w:t xml:space="preserve">&gt; </w:t>
+      </w:r>
+      <w:proofErr w:type="gramStart"/>
+      <w:r>
+        <w:t>[!IMPORTANT</w:t>
+      </w:r>
+      <w:proofErr w:type="gramEnd"/>
+      <w:r>
+        <w:t xml:space="preserve">]  </w:t>
+      </w:r>
+    </w:p>
+    <w:p>
+      <w:r>
+        <w:t>&gt; Please review the proposed directory structure for the shared utilities and the Git branching strategy before I begin writing the extraction script or scaffolding the components.</w:t>
+      </w:r>
+    </w:p>
+    <w:p/>
+    <w:p>
+      <w:r>
+        <w:t>## Proposed Changes</w:t>
+      </w:r>
+    </w:p>
+    <w:p/>
+    <w:p>
+      <w:r>
+        <w:t>### Phase 1: Branching</w:t>
+      </w:r>
+    </w:p>
+    <w:p>
+      <w:r>
+        <w:t>- We will branch off `master` into a new feature branch: `feature/data-extraction-utilities`. This isolates our work for review before merging.</w:t>
+      </w:r>
+    </w:p>
+    <w:p/>
+    <w:p>
+      <w:r>
+        <w:t>### Phase 2: Homogeneous Utilities &amp; Components Architecture</w:t>
+      </w:r>
+    </w:p>
+    <w:p>
+      <w:r>
+        <w:t>To ensure bespoke warnings, alerts, and filtering are reusable and centrally managed, we will scaffold the following structure:</w:t>
+      </w:r>
+    </w:p>
+    <w:p/>
+    <w:p>
+      <w:r>
+        <w:t>#### [NEW] `</w:t>
+      </w:r>
+      <w:proofErr w:type="spellStart"/>
+      <w:r>
+        <w:t>src</w:t>
+      </w:r>
+      <w:proofErr w:type="spellEnd"/>
+      <w:r>
+        <w:t>/components/common/`</w:t>
+      </w:r>
+    </w:p>
+    <w:p>
+      <w:r>
+        <w:t>This directory will house all reusable, domain-agnostic UI elements.</w:t>
+      </w:r>
+    </w:p>
+    <w:p>
+      <w:r>
+        <w:t>- `</w:t>
+      </w:r>
+      <w:proofErr w:type="spellStart"/>
+      <w:r>
+        <w:t>Alert.tsx</w:t>
+      </w:r>
+      <w:proofErr w:type="spellEnd"/>
+      <w:r>
+        <w:t>`: A standard, styling-consistent alert component for system messages or warnings.</w:t>
+      </w:r>
+    </w:p>
+    <w:p>
+      <w:r>
+        <w:t>- `</w:t>
+      </w:r>
+      <w:proofErr w:type="spellStart"/>
+      <w:r>
+        <w:t>UserPrompt.tsx</w:t>
+      </w:r>
+      <w:proofErr w:type="spellEnd"/>
+      <w:r>
+        <w:t>`: A unified interaction dialog for prompting user input during gamified sections.</w:t>
+      </w:r>
+    </w:p>
+    <w:p/>
+    <w:p>
+      <w:r>
+        <w:t>#### [NEW] `</w:t>
+      </w:r>
+      <w:proofErr w:type="spellStart"/>
+      <w:r>
+        <w:t>src</w:t>
+      </w:r>
+      <w:proofErr w:type="spellEnd"/>
+      <w:r>
+        <w:t>/utils/`</w:t>
+      </w:r>
+    </w:p>
+    <w:p>
+      <w:r>
+        <w:t>This directory will house pure functions and singleton services.</w:t>
+      </w:r>
+    </w:p>
+    <w:p>
+      <w:r>
+        <w:t>- `</w:t>
+      </w:r>
+      <w:proofErr w:type="spellStart"/>
+      <w:r>
+        <w:t>profanityFilter.ts</w:t>
+      </w:r>
+      <w:proofErr w:type="spellEnd"/>
+      <w:r>
+        <w:t>`: A modular filter that scrubs user input across any learning module.</w:t>
+      </w:r>
+    </w:p>
+    <w:p>
+      <w:r>
+        <w:t>- `</w:t>
+      </w:r>
+      <w:proofErr w:type="spellStart"/>
+      <w:r>
+        <w:t>logger.ts</w:t>
+      </w:r>
+      <w:proofErr w:type="spellEnd"/>
+      <w:r>
+        <w:t>`: A centralized messaging and warning system.</w:t>
+      </w:r>
+    </w:p>
+    <w:p/>
+    <w:p>
+      <w:r>
+        <w:lastRenderedPageBreak/>
+        <w:t>### Phase 3: Python Data Extraction Spike</w:t>
+      </w:r>
+    </w:p>
+    <w:p>
+      <w:r>
+        <w:t>We will write a headless Python script to interface with the Windows COM API, allowing us to read the proprietary `.doc` binary format.</w:t>
+      </w:r>
+    </w:p>
+    <w:p/>
+    <w:p>
+      <w:r>
+        <w:t>#### [NEW] `scripts/extract_docs.py`</w:t>
+      </w:r>
+    </w:p>
+    <w:p>
+      <w:r>
+        <w:t>- Uses `win32com.client` to dispatch a hidden Microsoft Word instance.</w:t>
+      </w:r>
+    </w:p>
+    <w:p>
+      <w:r>
+        <w:t>- Targets `D:\quiz_system\Docs\WS1 Hazardous substances symbols (Q&amp;A).doc`.</w:t>
+      </w:r>
+    </w:p>
+    <w:p>
+      <w:r>
+        <w:t>- Extracts raw text content and exports it to `D:\quiz_system\src\data\raw\ws1_raw.txt` for subsequent schema mapping.</w:t>
+      </w:r>
+    </w:p>
+    <w:p/>
+    <w:p>
+      <w:r>
+        <w:t>## Verification Plan</w:t>
+      </w:r>
+    </w:p>
+    <w:p/>
+    <w:p>
+      <w:r>
+        <w:t>### Automated Tests</w:t>
+      </w:r>
+    </w:p>
+    <w:p>
+      <w:r>
+        <w:t>- Verify the Python script executes without throwing COM errors.</w:t>
+      </w:r>
+    </w:p>
+    <w:p>
+      <w:r>
+        <w:t>- Ensure the output `.txt` file is populated with the worksheet's raw text.</w:t>
+      </w:r>
+    </w:p>
+    <w:p/>
+    <w:p>
+      <w:r>
+        <w:t>### Manual Verification</w:t>
+      </w:r>
+    </w:p>
+    <w:p>
+      <w:r>
+        <w:t>- Review the generated utility components (`Alert`, `</w:t>
+      </w:r>
+      <w:proofErr w:type="spellStart"/>
+      <w:r>
+        <w:t>profanityFilter</w:t>
+      </w:r>
+      <w:proofErr w:type="spellEnd"/>
+      <w:r>
+        <w:t>`) for reusability.</w:t>
+      </w:r>
+    </w:p>
+    <w:p>
+      <w:r>
+        <w:t>- Inspect the extracted `ws1_raw.txt` to confirm no critical text (questions/answers) was lost in translation from the binary `.doc` format.</w:t>
+      </w:r>
+    </w:p>
+    <w:p>
+      <w:r>
+        <w:br w:type="page"/>
+      </w:r>
+    </w:p>
+    <w:p/>
     <w:sectPr>
       <w:pgSz w:w="11906" w:h="16838"/>
       <w:pgMar w:top="1440" w:right="1440" w:bottom="1440" w:left="1440" w:header="708" w:footer="708" w:gutter="0"/>

</xml_diff>